<commit_message>
feat(inbox/aan): Book 07 SQL Auth Modernization briefing deck + figure write-back
30-slide spec-compliant deck (Date Code 2026-07-07 16:23 ET): Kerberos/NTLM
inherited problem, Arc Managed Identity bridge (Layer 1/2, alternatives),
NTLM elimination 3-phase build, login migration 4-phase parallel-run build,
Entra perimeter, app chain classes, control closure + 20x KSIs, compliance
clock, 2-slide Book 08 runbook appendix. Write-back adds san-fig-07/08/09
(consolidation gate, Entra perimeter, PKI) to the qmd; docx re-rendered
(9 figures). Zip kit refreshed to 2026-07-07_1625ET (31 entries).

Co-Authored-By: Claude Fable 5 <noreply@anthropic.com>
</commit_message>
<xml_diff>
--- a/inbox/Application Aware Networking/Book_07_FedAAN_SQL_Server_Authentication_Modernization.docx
+++ b/inbox/Application Aware Networking/Book_07_FedAAN_SQL_Server_Authentication_Modernization.docx
@@ -31,7 +31,7 @@
         <w:pStyle w:val="Date"/>
       </w:pPr>
       <w:r>
-        <w:t xml:space="preserve">2026-07-01</w:t>
+        <w:t xml:space="preserve">Invalid Date</w:t>
       </w:r>
     </w:p>
     <w:sdt>
@@ -106,7 +106,7 @@
                     <a:graphicData uri="http://schemas.openxmlformats.org/drawingml/2006/picture">
                       <pic:pic>
                         <pic:nvPicPr>
-                          <pic:cNvPr descr="/opt/quarto/share/formats/docx/warning.png" id="11" name="Picture"/>
+                          <pic:cNvPr descr="C:\Program Files\Quarto\share\formats\docx\warning.png" id="11" name="Picture"/>
                           <pic:cNvPicPr>
                             <a:picLocks noChangeArrowheads="1" noChangeAspect="1"/>
                           </pic:cNvPicPr>
@@ -166,7 +166,7 @@
               <w:pStyle w:val="BodyText"/>
             </w:pPr>
             <w:pPr>
-              <w:spacing w:before="16" w:after="16"/>
+              <w:spacing w:before="16"/>
             </w:pPr>
             <w:r>
               <w:t xml:space="preserve">This document is a</w:t>
@@ -199,6 +199,27 @@
             </w:r>
             <w:r>
               <w:t xml:space="preserve">. It is an attempt at a comprehensive SSA-wide technical roadmap and has not been reviewed or approved by the SSA CIO Office, the Office of Information Security (OIS), or organizational leadership. All recommendations, vendor selections, control mappings, and implementation timelines are subject to revision pending formal review by the SSA CIO Office and organizational components.</w:t>
+            </w:r>
+          </w:p>
+          <w:p>
+            <w:pPr>
+              <w:pStyle w:val="BodyText"/>
+            </w:pPr>
+            <w:pPr>
+              <w:spacing w:after="16"/>
+            </w:pPr>
+            <w:r>
+              <w:rPr>
+                <w:b/>
+                <w:bCs/>
+              </w:rPr>
+              <w:t xml:space="preserve">Date Code:</w:t>
+            </w:r>
+            <w:r>
+              <w:t xml:space="preserve"> </w:t>
+            </w:r>
+            <w:r>
+              <w:t xml:space="preserve">2026-07-07 16:26 ET</w:t>
             </w:r>
           </w:p>
           <w:p/>
@@ -259,7 +280,7 @@
                     <a:graphicData uri="http://schemas.openxmlformats.org/drawingml/2006/picture">
                       <pic:pic>
                         <pic:nvPicPr>
-                          <pic:cNvPr descr="/opt/quarto/share/formats/docx/important.png" id="14" name="Picture"/>
+                          <pic:cNvPr descr="C:\Program Files\Quarto\share\formats\docx\important.png" id="14" name="Picture"/>
                           <pic:cNvPicPr>
                             <a:picLocks noChangeArrowheads="1" noChangeAspect="1"/>
                           </pic:cNvPicPr>
@@ -650,7 +671,7 @@
     </w:p>
     <w:bookmarkEnd w:id="20"/>
     <w:bookmarkEnd w:id="21"/>
-    <w:bookmarkStart w:id="24" w:name="the-estate-what-must-be-discovered"/>
+    <w:bookmarkStart w:id="28" w:name="the-estate-what-must-be-discovered"/>
     <w:p>
       <w:pPr>
         <w:pStyle w:val="Heading1"/>
@@ -757,7 +778,7 @@
       </w:r>
     </w:p>
     <w:bookmarkEnd w:id="22"/>
-    <w:bookmarkStart w:id="23" w:name="the-consolidation-gate"/>
+    <w:bookmarkStart w:id="27" w:name="the-consolidation-gate"/>
     <w:p>
       <w:pPr>
         <w:pStyle w:val="Heading2"/>
@@ -834,25 +855,6 @@
       </w:pPr>
       <w:r>
         <w:t xml:space="preserve">Instances that survive the consolidation gate proceed to authentication modernization. Instances that do not survive are documented and decommissioned per change management policy.</w:t>
-      </w:r>
-    </w:p>
-    <w:bookmarkEnd w:id="23"/>
-    <w:bookmarkEnd w:id="24"/>
-    <w:bookmarkStart w:id="33" w:name="arc-as-the-identity-bridge"/>
-    <w:p>
-      <w:pPr>
-        <w:pStyle w:val="Heading1"/>
-      </w:pPr>
-      <w:r>
-        <w:t xml:space="preserve">3. Arc as the Identity Bridge</w:t>
-      </w:r>
-    </w:p>
-    <w:p>
-      <w:pPr>
-        <w:pStyle w:val="FirstParagraph"/>
-      </w:pPr>
-      <w:r>
-        <w:t xml:space="preserve">Azure Arc resolves the SQL Server authentication problem in the most direct way possible: it replaces the domain credential entirely.</w:t>
       </w:r>
     </w:p>
     <w:tbl>
@@ -868,7 +870,7 @@
       <w:tr>
         <w:tc>
           <w:tcPr/>
-          <w:bookmarkStart w:id="28" w:name="fig-san02"/>
+          <w:bookmarkStart w:id="26" w:name="fig-san07"/>
           <w:p>
             <w:pPr>
               <w:pStyle w:val="Compact"/>
@@ -877,20 +879,118 @@
             <w:r>
               <w:drawing>
                 <wp:inline>
-                  <wp:extent cx="5334000" cy="1795096"/>
+                  <wp:extent cx="5334000" cy="3000375"/>
                   <wp:effectExtent b="0" l="0" r="0" t="0"/>
-                  <wp:docPr descr="" title="" id="26" name="Picture"/>
+                  <wp:docPr descr="" title="" id="24" name="Picture"/>
                   <a:graphic>
                     <a:graphicData uri="http://schemas.openxmlformats.org/drawingml/2006/picture">
                       <pic:pic>
                         <pic:nvPicPr>
-                          <pic:cNvPr descr="figs/san-fig-02-arc-managed-identity.png" id="27" name="Picture"/>
+                          <pic:cNvPr descr="figs/san-fig-07-consolidation-gate.png" id="25" name="Picture"/>
                           <pic:cNvPicPr>
                             <a:picLocks noChangeArrowheads="1" noChangeAspect="1"/>
                           </pic:cNvPicPr>
                         </pic:nvPicPr>
                         <pic:blipFill>
-                          <a:blip r:embed="rId25"/>
+                          <a:blip r:embed="rId23"/>
+                          <a:stretch>
+                            <a:fillRect/>
+                          </a:stretch>
+                        </pic:blipFill>
+                        <pic:spPr bwMode="auto">
+                          <a:xfrm>
+                            <a:off x="0" y="0"/>
+                            <a:ext cx="5334000" cy="3000375"/>
+                          </a:xfrm>
+                          <a:prstGeom prst="rect">
+                            <a:avLst/>
+                          </a:prstGeom>
+                          <a:noFill/>
+                          <a:ln w="9525">
+                            <a:noFill/>
+                            <a:headEnd/>
+                            <a:tailEnd/>
+                          </a:ln>
+                        </pic:spPr>
+                      </pic:pic>
+                    </a:graphicData>
+                  </a:graphic>
+                </wp:inline>
+              </w:drawing>
+            </w:r>
+          </w:p>
+          <w:p>
+            <w:pPr>
+              <w:jc w:val="center"/>
+            </w:pPr>
+            <w:pPr>
+              <w:jc w:val="left"/>
+              <w:spacing w:before="200"/>
+              <w:pStyle w:val="ImageCaption"/>
+            </w:pPr>
+            <w:r>
+              <w:t xml:space="preserve">Figure 2: The consolidation gate: three lenses, three outcomes</w:t>
+            </w:r>
+          </w:p>
+          <w:bookmarkEnd w:id="26"/>
+        </w:tc>
+      </w:tr>
+    </w:tbl>
+    <w:bookmarkEnd w:id="27"/>
+    <w:bookmarkEnd w:id="28"/>
+    <w:bookmarkStart w:id="37" w:name="arc-as-the-identity-bridge"/>
+    <w:p>
+      <w:pPr>
+        <w:pStyle w:val="Heading1"/>
+      </w:pPr>
+      <w:r>
+        <w:t xml:space="preserve">3. Arc as the Identity Bridge</w:t>
+      </w:r>
+    </w:p>
+    <w:p>
+      <w:pPr>
+        <w:pStyle w:val="FirstParagraph"/>
+      </w:pPr>
+      <w:r>
+        <w:t xml:space="preserve">Azure Arc resolves the SQL Server authentication problem in the most direct way possible: it replaces the domain credential entirely.</w:t>
+      </w:r>
+    </w:p>
+    <w:tbl>
+      <w:tblPr>
+        <w:tblStyle w:val="Table"/>
+        <w:tblW w:type="pct" w:w="5000"/>
+        <w:tblLayout w:type="fixed"/>
+        <w:tblLook w:firstRow="0" w:lastRow="0" w:firstColumn="0" w:lastColumn="0" w:noHBand="0" w:noVBand="0" w:val="0000"/>
+      </w:tblPr>
+      <w:tblGrid>
+        <w:gridCol w:w="7920"/>
+      </w:tblGrid>
+      <w:tr>
+        <w:tc>
+          <w:tcPr/>
+          <w:bookmarkStart w:id="32" w:name="fig-san02"/>
+          <w:p>
+            <w:pPr>
+              <w:pStyle w:val="Compact"/>
+              <w:jc w:val="center"/>
+            </w:pPr>
+            <w:r>
+              <w:drawing>
+                <wp:inline>
+                  <wp:extent cx="5334000" cy="1795096"/>
+                  <wp:effectExtent b="0" l="0" r="0" t="0"/>
+                  <wp:docPr descr="" title="" id="30" name="Picture"/>
+                  <a:graphic>
+                    <a:graphicData uri="http://schemas.openxmlformats.org/drawingml/2006/picture">
+                      <pic:pic>
+                        <pic:nvPicPr>
+                          <pic:cNvPr descr="figs/san-fig-02-arc-managed-identity.png" id="31" name="Picture"/>
+                          <pic:cNvPicPr>
+                            <a:picLocks noChangeArrowheads="1" noChangeAspect="1"/>
+                          </pic:cNvPicPr>
+                        </pic:nvPicPr>
+                        <pic:blipFill>
+                          <a:blip r:embed="rId29"/>
                           <a:stretch>
                             <a:fillRect/>
                           </a:stretch>
@@ -927,14 +1027,14 @@
               <w:pStyle w:val="ImageCaption"/>
             </w:pPr>
             <w:r>
-              <w:t xml:space="preserve">Figure 2: Azure Arc provides a system-assigned Managed Identity — no stored password, no rotation, no human-visible credential. Layer 1 targets SQL Engine authentication; Layer 2 targets OS-level Entra login.</w:t>
-            </w:r>
-          </w:p>
-          <w:bookmarkEnd w:id="28"/>
+              <w:t xml:space="preserve">Figure 3: Azure Arc provides a system-assigned Managed Identity — no stored password, no rotation, no human-visible credential. Layer 1 targets SQL Engine authentication; Layer 2 targets OS-level Entra login.</w:t>
+            </w:r>
+          </w:p>
+          <w:bookmarkEnd w:id="32"/>
         </w:tc>
       </w:tr>
     </w:tbl>
-    <w:bookmarkStart w:id="29" w:name="what-arc-provides"/>
+    <w:bookmarkStart w:id="33" w:name="what-arc-provides"/>
     <w:p>
       <w:pPr>
         <w:pStyle w:val="Heading2"/>
@@ -975,8 +1075,8 @@
         <w:t xml:space="preserve">The Managed Identity is registered in Entra ID as a service principal. SQL Server 2022 with the Entra authentication extension can use this identity to authenticate database connections from Entra-registered identities — users, groups, and other managed identities — without requiring any Active Directory credential.</w:t>
       </w:r>
     </w:p>
-    <w:bookmarkEnd w:id="29"/>
-    <w:bookmarkStart w:id="30" w:name="layer-1-sql-engine-authentication"/>
+    <w:bookmarkEnd w:id="33"/>
+    <w:bookmarkStart w:id="34" w:name="layer-1-sql-engine-authentication"/>
     <w:p>
       <w:pPr>
         <w:pStyle w:val="Heading2"/>
@@ -1098,8 +1198,8 @@
         <w:t xml:space="preserve">The host remains domain-joined. Group Policy still applies. SQL Server configuration is unchanged except for the authentication extension. The transition is transparent to the SQL Engine itself.</w:t>
       </w:r>
     </w:p>
-    <w:bookmarkEnd w:id="30"/>
-    <w:bookmarkStart w:id="31" w:name="layer-2-os-level-entra-login"/>
+    <w:bookmarkEnd w:id="34"/>
+    <w:bookmarkStart w:id="35" w:name="layer-2-os-level-entra-login"/>
     <w:p>
       <w:pPr>
         <w:pStyle w:val="Heading2"/>
@@ -1160,8 +1260,8 @@
         <w:t xml:space="preserve">Most federal SQL Server migration programs implement Layer 1 across the estate and Layer 2 on new deployments and greenfield systems. Legacy hosts that require domain join for other reasons (RADIUS, print services, legacy application hooks) may remain hybrid-joined for an extended transition period while Layer 1 is fully deployed.</w:t>
       </w:r>
     </w:p>
-    <w:bookmarkEnd w:id="31"/>
-    <w:bookmarkStart w:id="32" w:name="why-arc-and-not-the-alternatives"/>
+    <w:bookmarkEnd w:id="35"/>
+    <w:bookmarkStart w:id="36" w:name="why-arc-and-not-the-alternatives"/>
     <w:p>
       <w:pPr>
         <w:pStyle w:val="Heading2"/>
@@ -1250,9 +1350,9 @@
         <w:t xml:space="preserve">The sole credential-free, cloud-native option. No stored secret, no rotation burden, no AD dependency. The certificate is managed by the Arc agent and is not accessible to any user or process outside the agent context.</w:t>
       </w:r>
     </w:p>
-    <w:bookmarkEnd w:id="32"/>
-    <w:bookmarkEnd w:id="33"/>
-    <w:bookmarkStart w:id="41" w:name="ntlm-elimination"/>
+    <w:bookmarkEnd w:id="36"/>
+    <w:bookmarkEnd w:id="37"/>
+    <w:bookmarkStart w:id="45" w:name="ntlm-elimination"/>
     <w:p>
       <w:pPr>
         <w:pStyle w:val="Heading1"/>
@@ -1282,7 +1382,7 @@
       <w:tr>
         <w:tc>
           <w:tcPr/>
-          <w:bookmarkStart w:id="37" w:name="fig-san03"/>
+          <w:bookmarkStart w:id="41" w:name="fig-san03"/>
           <w:p>
             <w:pPr>
               <w:pStyle w:val="Compact"/>
@@ -1293,18 +1393,18 @@
                 <wp:inline>
                   <wp:extent cx="5334000" cy="2282336"/>
                   <wp:effectExtent b="0" l="0" r="0" t="0"/>
-                  <wp:docPr descr="" title="" id="35" name="Picture"/>
+                  <wp:docPr descr="" title="" id="39" name="Picture"/>
                   <a:graphic>
                     <a:graphicData uri="http://schemas.openxmlformats.org/drawingml/2006/picture">
                       <pic:pic>
                         <pic:nvPicPr>
-                          <pic:cNvPr descr="figs/san-fig-03-ntlm-elimination.png" id="36" name="Picture"/>
+                          <pic:cNvPr descr="figs/san-fig-03-ntlm-elimination.png" id="40" name="Picture"/>
                           <pic:cNvPicPr>
                             <a:picLocks noChangeArrowheads="1" noChangeAspect="1"/>
                           </pic:cNvPicPr>
                         </pic:nvPicPr>
                         <pic:blipFill>
-                          <a:blip r:embed="rId34"/>
+                          <a:blip r:embed="rId38"/>
                           <a:stretch>
                             <a:fillRect/>
                           </a:stretch>
@@ -1341,14 +1441,14 @@
               <w:pStyle w:val="ImageCaption"/>
             </w:pPr>
             <w:r>
-              <w:t xml:space="preserve">Figure 3: NTLM elimination runs in three sequential phases: discovery, remediation, and domain-wide block. Each phase has measurable exit criteria before the next begins.</w:t>
-            </w:r>
-          </w:p>
-          <w:bookmarkEnd w:id="37"/>
+              <w:t xml:space="preserve">Figure 4: NTLM elimination runs in three sequential phases: discovery, remediation, and domain-wide block. Each phase has measurable exit criteria before the next begins.</w:t>
+            </w:r>
+          </w:p>
+          <w:bookmarkEnd w:id="41"/>
         </w:tc>
       </w:tr>
     </w:tbl>
-    <w:bookmarkStart w:id="38" w:name="phase-a-discovery"/>
+    <w:bookmarkStart w:id="42" w:name="phase-a-discovery"/>
     <w:p>
       <w:pPr>
         <w:pStyle w:val="Heading2"/>
@@ -1570,8 +1670,8 @@
         <w:t xml:space="preserve">An application server that is not domain-joined cannot perform Kerberos authentication. It uses NTLM or SQL logins. Fix: Domain join, Arc enrollment, or migration to Entra-native application authentication.</w:t>
       </w:r>
     </w:p>
-    <w:bookmarkEnd w:id="38"/>
-    <w:bookmarkStart w:id="39" w:name="phase-b-remediation"/>
+    <w:bookmarkEnd w:id="42"/>
+    <w:bookmarkStart w:id="43" w:name="phase-b-remediation"/>
     <w:p>
       <w:pPr>
         <w:pStyle w:val="Heading2"/>
@@ -1712,8 +1812,8 @@
         <w:t xml:space="preserve">). NTLMv1 has no legitimate use case in a federal environment and is prohibited under BOD 25-01.</w:t>
       </w:r>
     </w:p>
-    <w:bookmarkEnd w:id="39"/>
-    <w:bookmarkStart w:id="40" w:name="phase-c-domain-wide-block"/>
+    <w:bookmarkEnd w:id="43"/>
+    <w:bookmarkStart w:id="44" w:name="phase-c-domain-wide-block"/>
     <w:p>
       <w:pPr>
         <w:pStyle w:val="Heading2"/>
@@ -1746,9 +1846,9 @@
         <w:t xml:space="preserve">Phase C completion is the evidence baseline for the AU-2/AU-12 controls in the FedRAMP 20x continuous monitoring record.</w:t>
       </w:r>
     </w:p>
-    <w:bookmarkEnd w:id="40"/>
-    <w:bookmarkEnd w:id="41"/>
-    <w:bookmarkStart w:id="51" w:name="the-login-migration"/>
+    <w:bookmarkEnd w:id="44"/>
+    <w:bookmarkEnd w:id="45"/>
+    <w:bookmarkStart w:id="55" w:name="the-login-migration"/>
     <w:p>
       <w:pPr>
         <w:pStyle w:val="Heading1"/>
@@ -1778,7 +1878,7 @@
       <w:tr>
         <w:tc>
           <w:tcPr/>
-          <w:bookmarkStart w:id="45" w:name="fig-san04"/>
+          <w:bookmarkStart w:id="49" w:name="fig-san04"/>
           <w:p>
             <w:pPr>
               <w:pStyle w:val="Compact"/>
@@ -1789,18 +1889,18 @@
                 <wp:inline>
                   <wp:extent cx="5334000" cy="1887415"/>
                   <wp:effectExtent b="0" l="0" r="0" t="0"/>
-                  <wp:docPr descr="" title="" id="43" name="Picture"/>
+                  <wp:docPr descr="" title="" id="47" name="Picture"/>
                   <a:graphic>
                     <a:graphicData uri="http://schemas.openxmlformats.org/drawingml/2006/picture">
                       <pic:pic>
                         <pic:nvPicPr>
-                          <pic:cNvPr descr="figs/san-fig-04-login-migration.png" id="44" name="Picture"/>
+                          <pic:cNvPr descr="figs/san-fig-04-login-migration.png" id="48" name="Picture"/>
                           <pic:cNvPicPr>
                             <a:picLocks noChangeArrowheads="1" noChangeAspect="1"/>
                           </pic:cNvPicPr>
                         </pic:nvPicPr>
                         <pic:blipFill>
-                          <a:blip r:embed="rId42"/>
+                          <a:blip r:embed="rId46"/>
                           <a:stretch>
                             <a:fillRect/>
                           </a:stretch>
@@ -1837,14 +1937,14 @@
               <w:pStyle w:val="ImageCaption"/>
             </w:pPr>
             <w:r>
-              <w:t xml:space="preserve">Figure 4: Login migration runs in four phases. The legacy login is never dropped until a 30-day clean observation period completes with zero authentication events using the old identity.</w:t>
-            </w:r>
-          </w:p>
-          <w:bookmarkEnd w:id="45"/>
+              <w:t xml:space="preserve">Figure 5: Login migration runs in four phases. The legacy login is never dropped until a 30-day clean observation period completes with zero authentication events using the old identity.</w:t>
+            </w:r>
+          </w:p>
+          <w:bookmarkEnd w:id="49"/>
         </w:tc>
       </w:tr>
     </w:tbl>
-    <w:bookmarkStart w:id="46" w:name="login-types-and-migration-targets"/>
+    <w:bookmarkStart w:id="50" w:name="login-types-and-migration-targets"/>
     <w:p>
       <w:pPr>
         <w:pStyle w:val="Heading2"/>
@@ -1927,8 +2027,8 @@
         <w:t xml:space="preserve">. Authenticated via Entra ID token. These are the migration target.</w:t>
       </w:r>
     </w:p>
-    <w:bookmarkEnd w:id="46"/>
-    <w:bookmarkStart w:id="49" w:name="the-four-phase-parallel-run"/>
+    <w:bookmarkEnd w:id="50"/>
+    <w:bookmarkStart w:id="53" w:name="the-four-phase-parallel-run"/>
     <w:p>
       <w:pPr>
         <w:pStyle w:val="Heading2"/>
@@ -2103,12 +2203,12 @@
                 <wp:inline>
                   <wp:extent cx="152400" cy="152400"/>
                   <wp:effectExtent b="0" l="0" r="0" t="0"/>
-                  <wp:docPr descr="" title="" id="47" name="Picture"/>
+                  <wp:docPr descr="" title="" id="51" name="Picture"/>
                   <a:graphic>
                     <a:graphicData uri="http://schemas.openxmlformats.org/drawingml/2006/picture">
                       <pic:pic>
                         <pic:nvPicPr>
-                          <pic:cNvPr descr="/opt/quarto/share/formats/docx/important.png" id="48" name="Picture"/>
+                          <pic:cNvPr descr="C:\Program Files\Quarto\share\formats\docx\important.png" id="52" name="Picture"/>
                           <pic:cNvPicPr>
                             <a:picLocks noChangeArrowheads="1" noChangeAspect="1"/>
                           </pic:cNvPicPr>
@@ -2188,8 +2288,8 @@
         </w:tc>
       </w:tr>
     </w:tbl>
-    <w:bookmarkEnd w:id="49"/>
-    <w:bookmarkStart w:id="50" w:name="the-sa-account"/>
+    <w:bookmarkEnd w:id="53"/>
+    <w:bookmarkStart w:id="54" w:name="the-sa-account"/>
     <w:p>
       <w:pPr>
         <w:pStyle w:val="Heading2"/>
@@ -2329,9 +2429,9 @@
         <w:t xml:space="preserve">Disabling sa is a CM-8 inventory action and should be documented in the instance’s change record. The renamed, disabled account remains in the login list as evidence that the action was taken.</w:t>
       </w:r>
     </w:p>
-    <w:bookmarkEnd w:id="50"/>
-    <w:bookmarkEnd w:id="51"/>
-    <w:bookmarkStart w:id="54" w:name="access-control-and-the-entra-perimeter"/>
+    <w:bookmarkEnd w:id="54"/>
+    <w:bookmarkEnd w:id="55"/>
+    <w:bookmarkStart w:id="62" w:name="access-control-and-the-entra-perimeter"/>
     <w:p>
       <w:pPr>
         <w:pStyle w:val="Heading1"/>
@@ -2348,7 +2448,7 @@
         <w:t xml:space="preserve">Entra ID Conditional Access, when applied to SQL Server connections, creates an authentication perimeter that cannot be expressed in SQL Server itself. SQL Server can grant or deny based on login existence and database role. It cannot enforce MFA, device compliance, or location policy. Entra ID can.</w:t>
       </w:r>
     </w:p>
-    <w:bookmarkStart w:id="52" w:name="X8e2eef1b5223fab3c205906d44c8894713407b8"/>
+    <w:bookmarkStart w:id="60" w:name="X8e2eef1b5223fab3c205906d44c8894713407b8"/>
     <w:p>
       <w:pPr>
         <w:pStyle w:val="Heading2"/>
@@ -2388,163 +2488,6 @@
       </w:pPr>
       <w:r>
         <w:t xml:space="preserve">This is the identity lifecycle enforcement mechanism: access is derived from employment status and role, not from a ticket submitted to a DBA.</w:t>
-      </w:r>
-    </w:p>
-    <w:bookmarkEnd w:id="52"/>
-    <w:bookmarkStart w:id="53" w:name="conditional-access-policies-for-sql"/>
-    <w:p>
-      <w:pPr>
-        <w:pStyle w:val="Heading2"/>
-      </w:pPr>
-      <w:r>
-        <w:t xml:space="preserve">6.2 Conditional Access Policies for SQL</w:t>
-      </w:r>
-    </w:p>
-    <w:p>
-      <w:pPr>
-        <w:pStyle w:val="FirstParagraph"/>
-      </w:pPr>
-      <w:r>
-        <w:t xml:space="preserve">Entra ID Conditional Access policies are applied to the Entra authentication flow that SQL clients use. Policies can enforce:</w:t>
-      </w:r>
-    </w:p>
-    <w:p>
-      <w:pPr>
-        <w:pStyle w:val="Compact"/>
-        <w:numPr>
-          <w:ilvl w:val="0"/>
-          <w:numId w:val="1005"/>
-        </w:numPr>
-      </w:pPr>
-      <w:r>
-        <w:rPr>
-          <w:b/>
-          <w:bCs/>
-        </w:rPr>
-        <w:t xml:space="preserve">MFA for privileged logins.</w:t>
-      </w:r>
-      <w:r>
-        <w:t xml:space="preserve"> </w:t>
-      </w:r>
-      <w:r>
-        <w:t xml:space="preserve">DBA logins (members of</w:t>
-      </w:r>
-      <w:r>
-        <w:t xml:space="preserve"> </w:t>
-      </w:r>
-      <w:r>
-        <w:rPr>
-          <w:rStyle w:val="VerbatimChar"/>
-        </w:rPr>
-        <w:t xml:space="preserve">sysadmin</w:t>
-      </w:r>
-      <w:r>
-        <w:t xml:space="preserve">,</w:t>
-      </w:r>
-      <w:r>
-        <w:t xml:space="preserve"> </w:t>
-      </w:r>
-      <w:r>
-        <w:rPr>
-          <w:rStyle w:val="VerbatimChar"/>
-        </w:rPr>
-        <w:t xml:space="preserve">securityadmin</w:t>
-      </w:r>
-      <w:r>
-        <w:t xml:space="preserve">, or custom privileged groups) require MFA at every authentication.</w:t>
-      </w:r>
-    </w:p>
-    <w:p>
-      <w:pPr>
-        <w:pStyle w:val="Compact"/>
-        <w:numPr>
-          <w:ilvl w:val="0"/>
-          <w:numId w:val="1005"/>
-        </w:numPr>
-      </w:pPr>
-      <w:r>
-        <w:rPr>
-          <w:b/>
-          <w:bCs/>
-        </w:rPr>
-        <w:t xml:space="preserve">Device compliance.</w:t>
-      </w:r>
-      <w:r>
-        <w:t xml:space="preserve"> </w:t>
-      </w:r>
-      <w:r>
-        <w:t xml:space="preserve">Connections from devices not enrolled in the MDM system are blocked. This eliminates authentication from unmanaged endpoints.</w:t>
-      </w:r>
-    </w:p>
-    <w:p>
-      <w:pPr>
-        <w:pStyle w:val="Compact"/>
-        <w:numPr>
-          <w:ilvl w:val="0"/>
-          <w:numId w:val="1005"/>
-        </w:numPr>
-      </w:pPr>
-      <w:r>
-        <w:rPr>
-          <w:b/>
-          <w:bCs/>
-        </w:rPr>
-        <w:t xml:space="preserve">Location restrictions.</w:t>
-      </w:r>
-      <w:r>
-        <w:t xml:space="preserve"> </w:t>
-      </w:r>
-      <w:r>
-        <w:t xml:space="preserve">Authentication from outside defined trusted IP ranges requires MFA step-up or is blocked entirely. This addresses contractor and vendor access from personal systems.</w:t>
-      </w:r>
-    </w:p>
-    <w:p>
-      <w:pPr>
-        <w:pStyle w:val="Compact"/>
-        <w:numPr>
-          <w:ilvl w:val="0"/>
-          <w:numId w:val="1005"/>
-        </w:numPr>
-      </w:pPr>
-      <w:r>
-        <w:rPr>
-          <w:b/>
-          <w:bCs/>
-        </w:rPr>
-        <w:t xml:space="preserve">Session time limits.</w:t>
-      </w:r>
-      <w:r>
-        <w:t xml:space="preserve"> </w:t>
-      </w:r>
-      <w:r>
-        <w:t xml:space="preserve">Access tokens for SQL connections have a configurable lifetime. Privileged sessions are time-limited and require re-authentication after expiry.</w:t>
-      </w:r>
-    </w:p>
-    <w:p>
-      <w:pPr>
-        <w:pStyle w:val="FirstParagraph"/>
-      </w:pPr>
-      <w:r>
-        <w:t xml:space="preserve">Conditional Access policies are configured at the Entra tenant level and apply to all SQL connections authenticated via Entra — there is no per-instance configuration required in SQL Server.</w:t>
-      </w:r>
-    </w:p>
-    <w:bookmarkEnd w:id="53"/>
-    <w:bookmarkEnd w:id="54"/>
-    <w:bookmarkStart w:id="62" w:name="the-application-chain"/>
-    <w:p>
-      <w:pPr>
-        <w:pStyle w:val="Heading1"/>
-      </w:pPr>
-      <w:r>
-        <w:t xml:space="preserve">7. The Application Chain</w:t>
-      </w:r>
-    </w:p>
-    <w:p>
-      <w:pPr>
-        <w:pStyle w:val="FirstParagraph"/>
-      </w:pPr>
-      <w:r>
-        <w:t xml:space="preserve">Every application that connects to SQL Server carries an authentication assumption. Connection strings, ODBC data sources, service accounts, and application configuration files all encode the authentication method. These must all be updated as part of the login migration program.</w:t>
       </w:r>
     </w:p>
     <w:tbl>
@@ -2560,7 +2503,7 @@
       <w:tr>
         <w:tc>
           <w:tcPr/>
-          <w:bookmarkStart w:id="58" w:name="fig-san05"/>
+          <w:bookmarkStart w:id="59" w:name="fig-san08"/>
           <w:p>
             <w:pPr>
               <w:pStyle w:val="Compact"/>
@@ -2569,20 +2512,256 @@
             <w:r>
               <w:drawing>
                 <wp:inline>
-                  <wp:extent cx="5334000" cy="2128471"/>
+                  <wp:extent cx="5334000" cy="3000375"/>
                   <wp:effectExtent b="0" l="0" r="0" t="0"/>
-                  <wp:docPr descr="" title="" id="56" name="Picture"/>
+                  <wp:docPr descr="" title="" id="57" name="Picture"/>
                   <a:graphic>
                     <a:graphicData uri="http://schemas.openxmlformats.org/drawingml/2006/picture">
                       <pic:pic>
                         <pic:nvPicPr>
-                          <pic:cNvPr descr="figs/san-fig-05-app-chain.png" id="57" name="Picture"/>
+                          <pic:cNvPr descr="figs/san-fig-08-entra-perimeter.png" id="58" name="Picture"/>
                           <pic:cNvPicPr>
                             <a:picLocks noChangeArrowheads="1" noChangeAspect="1"/>
                           </pic:cNvPicPr>
                         </pic:nvPicPr>
                         <pic:blipFill>
-                          <a:blip r:embed="rId55"/>
+                          <a:blip r:embed="rId56"/>
+                          <a:stretch>
+                            <a:fillRect/>
+                          </a:stretch>
+                        </pic:blipFill>
+                        <pic:spPr bwMode="auto">
+                          <a:xfrm>
+                            <a:off x="0" y="0"/>
+                            <a:ext cx="5334000" cy="3000375"/>
+                          </a:xfrm>
+                          <a:prstGeom prst="rect">
+                            <a:avLst/>
+                          </a:prstGeom>
+                          <a:noFill/>
+                          <a:ln w="9525">
+                            <a:noFill/>
+                            <a:headEnd/>
+                            <a:tailEnd/>
+                          </a:ln>
+                        </pic:spPr>
+                      </pic:pic>
+                    </a:graphicData>
+                  </a:graphic>
+                </wp:inline>
+              </w:drawing>
+            </w:r>
+          </w:p>
+          <w:p>
+            <w:pPr>
+              <w:jc w:val="center"/>
+            </w:pPr>
+            <w:pPr>
+              <w:jc w:val="left"/>
+              <w:spacing w:before="200"/>
+              <w:pStyle w:val="ImageCaption"/>
+            </w:pPr>
+            <w:r>
+              <w:t xml:space="preserve">Figure 6: Entra dynamic groups: SQL authorization from HR attributes</w:t>
+            </w:r>
+          </w:p>
+          <w:bookmarkEnd w:id="59"/>
+        </w:tc>
+      </w:tr>
+    </w:tbl>
+    <w:bookmarkEnd w:id="60"/>
+    <w:bookmarkStart w:id="61" w:name="conditional-access-policies-for-sql"/>
+    <w:p>
+      <w:pPr>
+        <w:pStyle w:val="Heading2"/>
+      </w:pPr>
+      <w:r>
+        <w:t xml:space="preserve">6.2 Conditional Access Policies for SQL</w:t>
+      </w:r>
+    </w:p>
+    <w:p>
+      <w:pPr>
+        <w:pStyle w:val="FirstParagraph"/>
+      </w:pPr>
+      <w:r>
+        <w:t xml:space="preserve">Entra ID Conditional Access policies are applied to the Entra authentication flow that SQL clients use. Policies can enforce:</w:t>
+      </w:r>
+    </w:p>
+    <w:p>
+      <w:pPr>
+        <w:pStyle w:val="Compact"/>
+        <w:numPr>
+          <w:ilvl w:val="0"/>
+          <w:numId w:val="1005"/>
+        </w:numPr>
+      </w:pPr>
+      <w:r>
+        <w:rPr>
+          <w:b/>
+          <w:bCs/>
+        </w:rPr>
+        <w:t xml:space="preserve">MFA for privileged logins.</w:t>
+      </w:r>
+      <w:r>
+        <w:t xml:space="preserve"> </w:t>
+      </w:r>
+      <w:r>
+        <w:t xml:space="preserve">DBA logins (members of</w:t>
+      </w:r>
+      <w:r>
+        <w:t xml:space="preserve"> </w:t>
+      </w:r>
+      <w:r>
+        <w:rPr>
+          <w:rStyle w:val="VerbatimChar"/>
+        </w:rPr>
+        <w:t xml:space="preserve">sysadmin</w:t>
+      </w:r>
+      <w:r>
+        <w:t xml:space="preserve">,</w:t>
+      </w:r>
+      <w:r>
+        <w:t xml:space="preserve"> </w:t>
+      </w:r>
+      <w:r>
+        <w:rPr>
+          <w:rStyle w:val="VerbatimChar"/>
+        </w:rPr>
+        <w:t xml:space="preserve">securityadmin</w:t>
+      </w:r>
+      <w:r>
+        <w:t xml:space="preserve">, or custom privileged groups) require MFA at every authentication.</w:t>
+      </w:r>
+    </w:p>
+    <w:p>
+      <w:pPr>
+        <w:pStyle w:val="Compact"/>
+        <w:numPr>
+          <w:ilvl w:val="0"/>
+          <w:numId w:val="1005"/>
+        </w:numPr>
+      </w:pPr>
+      <w:r>
+        <w:rPr>
+          <w:b/>
+          <w:bCs/>
+        </w:rPr>
+        <w:t xml:space="preserve">Device compliance.</w:t>
+      </w:r>
+      <w:r>
+        <w:t xml:space="preserve"> </w:t>
+      </w:r>
+      <w:r>
+        <w:t xml:space="preserve">Connections from devices not enrolled in the MDM system are blocked. This eliminates authentication from unmanaged endpoints.</w:t>
+      </w:r>
+    </w:p>
+    <w:p>
+      <w:pPr>
+        <w:pStyle w:val="Compact"/>
+        <w:numPr>
+          <w:ilvl w:val="0"/>
+          <w:numId w:val="1005"/>
+        </w:numPr>
+      </w:pPr>
+      <w:r>
+        <w:rPr>
+          <w:b/>
+          <w:bCs/>
+        </w:rPr>
+        <w:t xml:space="preserve">Location restrictions.</w:t>
+      </w:r>
+      <w:r>
+        <w:t xml:space="preserve"> </w:t>
+      </w:r>
+      <w:r>
+        <w:t xml:space="preserve">Authentication from outside defined trusted IP ranges requires MFA step-up or is blocked entirely. This addresses contractor and vendor access from personal systems.</w:t>
+      </w:r>
+    </w:p>
+    <w:p>
+      <w:pPr>
+        <w:pStyle w:val="Compact"/>
+        <w:numPr>
+          <w:ilvl w:val="0"/>
+          <w:numId w:val="1005"/>
+        </w:numPr>
+      </w:pPr>
+      <w:r>
+        <w:rPr>
+          <w:b/>
+          <w:bCs/>
+        </w:rPr>
+        <w:t xml:space="preserve">Session time limits.</w:t>
+      </w:r>
+      <w:r>
+        <w:t xml:space="preserve"> </w:t>
+      </w:r>
+      <w:r>
+        <w:t xml:space="preserve">Access tokens for SQL connections have a configurable lifetime. Privileged sessions are time-limited and require re-authentication after expiry.</w:t>
+      </w:r>
+    </w:p>
+    <w:p>
+      <w:pPr>
+        <w:pStyle w:val="FirstParagraph"/>
+      </w:pPr>
+      <w:r>
+        <w:t xml:space="preserve">Conditional Access policies are configured at the Entra tenant level and apply to all SQL connections authenticated via Entra — there is no per-instance configuration required in SQL Server.</w:t>
+      </w:r>
+    </w:p>
+    <w:bookmarkEnd w:id="61"/>
+    <w:bookmarkEnd w:id="62"/>
+    <w:bookmarkStart w:id="70" w:name="the-application-chain"/>
+    <w:p>
+      <w:pPr>
+        <w:pStyle w:val="Heading1"/>
+      </w:pPr>
+      <w:r>
+        <w:t xml:space="preserve">7. The Application Chain</w:t>
+      </w:r>
+    </w:p>
+    <w:p>
+      <w:pPr>
+        <w:pStyle w:val="FirstParagraph"/>
+      </w:pPr>
+      <w:r>
+        <w:t xml:space="preserve">Every application that connects to SQL Server carries an authentication assumption. Connection strings, ODBC data sources, service accounts, and application configuration files all encode the authentication method. These must all be updated as part of the login migration program.</w:t>
+      </w:r>
+    </w:p>
+    <w:tbl>
+      <w:tblPr>
+        <w:tblStyle w:val="Table"/>
+        <w:tblW w:type="pct" w:w="5000"/>
+        <w:tblLayout w:type="fixed"/>
+        <w:tblLook w:firstRow="0" w:lastRow="0" w:firstColumn="0" w:lastColumn="0" w:noHBand="0" w:noVBand="0" w:val="0000"/>
+      </w:tblPr>
+      <w:tblGrid>
+        <w:gridCol w:w="7920"/>
+      </w:tblGrid>
+      <w:tr>
+        <w:tc>
+          <w:tcPr/>
+          <w:bookmarkStart w:id="66" w:name="fig-san05"/>
+          <w:p>
+            <w:pPr>
+              <w:pStyle w:val="Compact"/>
+              <w:jc w:val="center"/>
+            </w:pPr>
+            <w:r>
+              <w:drawing>
+                <wp:inline>
+                  <wp:extent cx="5334000" cy="2128471"/>
+                  <wp:effectExtent b="0" l="0" r="0" t="0"/>
+                  <wp:docPr descr="" title="" id="64" name="Picture"/>
+                  <a:graphic>
+                    <a:graphicData uri="http://schemas.openxmlformats.org/drawingml/2006/picture">
+                      <pic:pic>
+                        <pic:nvPicPr>
+                          <pic:cNvPr descr="figs/san-fig-05-app-chain.png" id="65" name="Picture"/>
+                          <pic:cNvPicPr>
+                            <a:picLocks noChangeArrowheads="1" noChangeAspect="1"/>
+                          </pic:cNvPicPr>
+                        </pic:nvPicPr>
+                        <pic:blipFill>
+                          <a:blip r:embed="rId63"/>
                           <a:stretch>
                             <a:fillRect/>
                           </a:stretch>
@@ -2619,14 +2798,14 @@
               <w:pStyle w:val="ImageCaption"/>
             </w:pPr>
             <w:r>
-              <w:t xml:space="preserve">Figure 5: Applications are classified into four categories based on their authentication modernization path. Class 3 (OIDC/Token) is the goal for all new work.</w:t>
-            </w:r>
-          </w:p>
-          <w:bookmarkEnd w:id="58"/>
+              <w:t xml:space="preserve">Figure 7: Applications are classified into four categories based on their authentication modernization path. Class 3 (OIDC/Token) is the goal for all new work.</w:t>
+            </w:r>
+          </w:p>
+          <w:bookmarkEnd w:id="66"/>
         </w:tc>
       </w:tr>
     </w:tbl>
-    <w:bookmarkStart w:id="59" w:name="application-authentication-classes"/>
+    <w:bookmarkStart w:id="67" w:name="application-authentication-classes"/>
     <w:p>
       <w:pPr>
         <w:pStyle w:val="Heading2"/>
@@ -2754,8 +2933,8 @@
         <w:t xml:space="preserve">The application requires AD for authentication and cannot use any of the above approaches. Azure AD Domain Services preserves the AD dependency in a managed form. This is the last resort — it preserves the AD dependency that the program is trying to eliminate. No new applications should be assigned Class 4.</w:t>
       </w:r>
     </w:p>
-    <w:bookmarkEnd w:id="59"/>
-    <w:bookmarkStart w:id="60" w:name="connection-string-transformation"/>
+    <w:bookmarkEnd w:id="67"/>
+    <w:bookmarkStart w:id="68" w:name="connection-string-transformation"/>
     <w:p>
       <w:pPr>
         <w:pStyle w:val="Heading2"/>
@@ -2849,8 +3028,8 @@
         <w:t xml:space="preserve">For applications running as Azure resources (App Service, Azure Functions, Container Apps), the available credential is the application’s Managed Identity. For applications running on Arc-enrolled servers, the available credential is the server’s Managed Identity. No stored credential is required.</w:t>
       </w:r>
     </w:p>
-    <w:bookmarkEnd w:id="60"/>
-    <w:bookmarkStart w:id="61" w:name="linked-server-migration"/>
+    <w:bookmarkEnd w:id="68"/>
+    <w:bookmarkStart w:id="69" w:name="linked-server-migration"/>
     <w:p>
       <w:pPr>
         <w:pStyle w:val="Heading2"/>
@@ -2948,9 +3127,9 @@
         <w:t xml:space="preserve">Linked servers to non-SQL systems (Oracle, PostgreSQL, OData) are audited for credential storage in the linked server definition.</w:t>
       </w:r>
     </w:p>
-    <w:bookmarkEnd w:id="61"/>
-    <w:bookmarkEnd w:id="62"/>
-    <w:bookmarkStart w:id="63" w:name="the-transformed-posture"/>
+    <w:bookmarkEnd w:id="69"/>
+    <w:bookmarkEnd w:id="70"/>
+    <w:bookmarkStart w:id="71" w:name="the-transformed-posture"/>
     <w:p>
       <w:pPr>
         <w:pStyle w:val="Heading1"/>
@@ -3368,8 +3547,8 @@
         </w:tc>
       </w:tr>
     </w:tbl>
-    <w:bookmarkEnd w:id="63"/>
-    <w:bookmarkStart w:id="64" w:name="X7c375571acb5b657b96618cf2d2b2b43503bddb"/>
+    <w:bookmarkEnd w:id="71"/>
+    <w:bookmarkStart w:id="76" w:name="X7c375571acb5b657b96618cf2d2b2b43503bddb"/>
     <w:p>
       <w:pPr>
         <w:pStyle w:val="Heading1"/>
@@ -3384,156 +3563,6 @@
       </w:pPr>
       <w:r>
         <w:t xml:space="preserve">SQL Server uses TLS for transport encryption. The TLS certificate chain anchors to a certificate authority. In federal environments this is typically an internal PKI (usually ADCS) or a FedRAMP-authorized certificate service.</w:t>
-      </w:r>
-    </w:p>
-    <w:p>
-      <w:pPr>
-        <w:pStyle w:val="BodyText"/>
-      </w:pPr>
-      <w:r>
-        <w:t xml:space="preserve">When Active Directory is retired or domain-unjoined servers are migrated to Entra, the ADCS infrastructure that issued server certificates must be addressed:</w:t>
-      </w:r>
-    </w:p>
-    <w:p>
-      <w:pPr>
-        <w:pStyle w:val="BodyText"/>
-      </w:pPr>
-      <w:r>
-        <w:rPr>
-          <w:b/>
-          <w:bCs/>
-        </w:rPr>
-        <w:t xml:space="preserve">Certificate renewal.</w:t>
-      </w:r>
-      <w:r>
-        <w:t xml:space="preserve"> </w:t>
-      </w:r>
-      <w:r>
-        <w:t xml:space="preserve">Domain-joined ADCS certificate auto-enrollment stops working when the host is domain-unjoined. A replacement enrollment mechanism — DigiCert, GlobalSign, or equivalent FedRAMP-authorized CA, or Azure Private CA — must be in place before the domain is unjoined.</w:t>
-      </w:r>
-    </w:p>
-    <w:p>
-      <w:pPr>
-        <w:pStyle w:val="BodyText"/>
-      </w:pPr>
-      <w:r>
-        <w:rPr>
-          <w:b/>
-          <w:bCs/>
-        </w:rPr>
-        <w:t xml:space="preserve">SQL Server TLS configuration.</w:t>
-      </w:r>
-      <w:r>
-        <w:t xml:space="preserve"> </w:t>
-      </w:r>
-      <w:r>
-        <w:t xml:space="preserve">SQL Server reads its TLS certificate from the local certificate store. The migration from ADCS-issued certificates to a new CA requires updating the SQL Server Configuration Manager to reference the new certificate and restarting the SQL Server service.</w:t>
-      </w:r>
-    </w:p>
-    <w:p>
-      <w:pPr>
-        <w:pStyle w:val="BodyText"/>
-      </w:pPr>
-      <w:r>
-        <w:rPr>
-          <w:b/>
-          <w:bCs/>
-        </w:rPr>
-        <w:t xml:space="preserve">Certificate pinning.</w:t>
-      </w:r>
-      <w:r>
-        <w:t xml:space="preserve"> </w:t>
-      </w:r>
-      <w:r>
-        <w:t xml:space="preserve">Some connection strings or ODBC configurations pin to a specific certificate thumbprint. These must be identified in the dependency inventory and updated before the certificate is replaced.</w:t>
-      </w:r>
-    </w:p>
-    <w:p>
-      <w:pPr>
-        <w:pStyle w:val="BodyText"/>
-      </w:pPr>
-      <w:r>
-        <w:t xml:space="preserve">The PKI surface is addressed in Part 1 of this series (Landing Zone IPAM/DDI/PKI). The certificate authority decisions made in Part 1 apply directly to the SQL Server certificate migration described here.</w:t>
-      </w:r>
-    </w:p>
-    <w:bookmarkEnd w:id="64"/>
-    <w:bookmarkStart w:id="67" w:name="database-platform-decisions"/>
-    <w:p>
-      <w:pPr>
-        <w:pStyle w:val="Heading1"/>
-      </w:pPr>
-      <w:r>
-        <w:t xml:space="preserve">10. Database Platform Decisions</w:t>
-      </w:r>
-    </w:p>
-    <w:p>
-      <w:pPr>
-        <w:pStyle w:val="FirstParagraph"/>
-      </w:pPr>
-      <w:r>
-        <w:t xml:space="preserve">The SQL Server modernization program creates a rationalization gate at which the platform decision for each workload is revisited. SQL Server 2022 with Arc Managed Identity is the primary target, but two alternative platforms are worth evaluating:</w:t>
-      </w:r>
-    </w:p>
-    <w:bookmarkStart w:id="65" w:name="postgresql-for-new-workloads"/>
-    <w:p>
-      <w:pPr>
-        <w:pStyle w:val="Heading2"/>
-      </w:pPr>
-      <w:r>
-        <w:t xml:space="preserve">10.1 PostgreSQL for New Workloads</w:t>
-      </w:r>
-    </w:p>
-    <w:p>
-      <w:pPr>
-        <w:pStyle w:val="FirstParagraph"/>
-      </w:pPr>
-      <w:r>
-        <w:t xml:space="preserve">PostgreSQL on Azure Database for PostgreSQL — Flexible Server supports Entra authentication natively. For new database workloads with no existing PL/SQL or T-SQL corpus, PostgreSQL avoids the SQL Server licensing cost and provides equivalent Entra authentication posture.</w:t>
-      </w:r>
-    </w:p>
-    <w:p>
-      <w:pPr>
-        <w:pStyle w:val="BodyText"/>
-      </w:pPr>
-      <w:r>
-        <w:t xml:space="preserve">For existing workloads, schema migration from SQL Server to PostgreSQL requires the SQL Server Migration Assistant (SSMA) for PostgreSQL and significant testing effort. This is appropriate when the licensing cost savings justify the migration investment — typically when the SQL Server instance is a new deployment or a simple schema with minimal stored procedures.</w:t>
-      </w:r>
-    </w:p>
-    <w:bookmarkEnd w:id="65"/>
-    <w:bookmarkStart w:id="66" w:name="azure-sql-managed-instance"/>
-    <w:p>
-      <w:pPr>
-        <w:pStyle w:val="Heading2"/>
-      </w:pPr>
-      <w:r>
-        <w:t xml:space="preserve">10.2 Azure SQL Managed Instance</w:t>
-      </w:r>
-    </w:p>
-    <w:p>
-      <w:pPr>
-        <w:pStyle w:val="FirstParagraph"/>
-      </w:pPr>
-      <w:r>
-        <w:t xml:space="preserve">Azure SQL Managed Instance is a fully managed SQL Server deployment in Azure that supports Entra authentication and provides a path to a cloud-native posture without infrastructure management. It is appropriate when the workload can move off on-premises infrastructure entirely and the agency’s cloud strategy supports Azure-native hosting.</w:t>
-      </w:r>
-    </w:p>
-    <w:p>
-      <w:pPr>
-        <w:pStyle w:val="BodyText"/>
-      </w:pPr>
-      <w:r>
-        <w:t xml:space="preserve">The authentication migration described in this document applies to Azure SQL Managed Instance identically — Entra logins, Managed Identity connections, and Conditional Access policies work the same way.</w:t>
-      </w:r>
-    </w:p>
-    <w:bookmarkEnd w:id="66"/>
-    <w:bookmarkEnd w:id="67"/>
-    <w:bookmarkStart w:id="75" w:name="federal-compliance-alignment"/>
-    <w:p>
-      <w:pPr>
-        <w:pStyle w:val="Heading1"/>
-      </w:pPr>
-      <w:r>
-        <w:t xml:space="preserve">11. Federal Compliance Alignment</w:t>
       </w:r>
     </w:p>
     <w:tbl>
@@ -3549,7 +3578,7 @@
       <w:tr>
         <w:tc>
           <w:tcPr/>
-          <w:bookmarkStart w:id="71" w:name="fig-san06"/>
+          <w:bookmarkStart w:id="75" w:name="fig-san09"/>
           <w:p>
             <w:pPr>
               <w:pStyle w:val="Compact"/>
@@ -3558,20 +3587,249 @@
             <w:r>
               <w:drawing>
                 <wp:inline>
-                  <wp:extent cx="5334000" cy="2000250"/>
+                  <wp:extent cx="5334000" cy="3000375"/>
                   <wp:effectExtent b="0" l="0" r="0" t="0"/>
-                  <wp:docPr descr="" title="" id="69" name="Picture"/>
+                  <wp:docPr descr="" title="" id="73" name="Picture"/>
                   <a:graphic>
                     <a:graphicData uri="http://schemas.openxmlformats.org/drawingml/2006/picture">
                       <pic:pic>
                         <pic:nvPicPr>
-                          <pic:cNvPr descr="figs/san-fig-06-fedramp-alignment.png" id="70" name="Picture"/>
+                          <pic:cNvPr descr="figs/san-fig-09-pki-dependencies.png" id="74" name="Picture"/>
                           <pic:cNvPicPr>
                             <a:picLocks noChangeArrowheads="1" noChangeAspect="1"/>
                           </pic:cNvPicPr>
                         </pic:nvPicPr>
                         <pic:blipFill>
-                          <a:blip r:embed="rId68"/>
+                          <a:blip r:embed="rId72"/>
+                          <a:stretch>
+                            <a:fillRect/>
+                          </a:stretch>
+                        </pic:blipFill>
+                        <pic:spPr bwMode="auto">
+                          <a:xfrm>
+                            <a:off x="0" y="0"/>
+                            <a:ext cx="5334000" cy="3000375"/>
+                          </a:xfrm>
+                          <a:prstGeom prst="rect">
+                            <a:avLst/>
+                          </a:prstGeom>
+                          <a:noFill/>
+                          <a:ln w="9525">
+                            <a:noFill/>
+                            <a:headEnd/>
+                            <a:tailEnd/>
+                          </a:ln>
+                        </pic:spPr>
+                      </pic:pic>
+                    </a:graphicData>
+                  </a:graphic>
+                </wp:inline>
+              </w:drawing>
+            </w:r>
+          </w:p>
+          <w:p>
+            <w:pPr>
+              <w:jc w:val="center"/>
+            </w:pPr>
+            <w:pPr>
+              <w:jc w:val="left"/>
+              <w:spacing w:before="200"/>
+              <w:pStyle w:val="ImageCaption"/>
+            </w:pPr>
+            <w:r>
+              <w:t xml:space="preserve">Figure 8: PKI: what breaks when the domain goes away</w:t>
+            </w:r>
+          </w:p>
+          <w:bookmarkEnd w:id="75"/>
+        </w:tc>
+      </w:tr>
+    </w:tbl>
+    <w:p>
+      <w:pPr>
+        <w:pStyle w:val="BodyText"/>
+      </w:pPr>
+      <w:r>
+        <w:t xml:space="preserve">When Active Directory is retired or domain-unjoined servers are migrated to Entra, the ADCS infrastructure that issued server certificates must be addressed:</w:t>
+      </w:r>
+    </w:p>
+    <w:p>
+      <w:pPr>
+        <w:pStyle w:val="BodyText"/>
+      </w:pPr>
+      <w:r>
+        <w:rPr>
+          <w:b/>
+          <w:bCs/>
+        </w:rPr>
+        <w:t xml:space="preserve">Certificate renewal.</w:t>
+      </w:r>
+      <w:r>
+        <w:t xml:space="preserve"> </w:t>
+      </w:r>
+      <w:r>
+        <w:t xml:space="preserve">Domain-joined ADCS certificate auto-enrollment stops working when the host is domain-unjoined. A replacement enrollment mechanism — DigiCert, GlobalSign, or equivalent FedRAMP-authorized CA, or Azure Private CA — must be in place before the domain is unjoined.</w:t>
+      </w:r>
+    </w:p>
+    <w:p>
+      <w:pPr>
+        <w:pStyle w:val="BodyText"/>
+      </w:pPr>
+      <w:r>
+        <w:rPr>
+          <w:b/>
+          <w:bCs/>
+        </w:rPr>
+        <w:t xml:space="preserve">SQL Server TLS configuration.</w:t>
+      </w:r>
+      <w:r>
+        <w:t xml:space="preserve"> </w:t>
+      </w:r>
+      <w:r>
+        <w:t xml:space="preserve">SQL Server reads its TLS certificate from the local certificate store. The migration from ADCS-issued certificates to a new CA requires updating the SQL Server Configuration Manager to reference the new certificate and restarting the SQL Server service.</w:t>
+      </w:r>
+    </w:p>
+    <w:p>
+      <w:pPr>
+        <w:pStyle w:val="BodyText"/>
+      </w:pPr>
+      <w:r>
+        <w:rPr>
+          <w:b/>
+          <w:bCs/>
+        </w:rPr>
+        <w:t xml:space="preserve">Certificate pinning.</w:t>
+      </w:r>
+      <w:r>
+        <w:t xml:space="preserve"> </w:t>
+      </w:r>
+      <w:r>
+        <w:t xml:space="preserve">Some connection strings or ODBC configurations pin to a specific certificate thumbprint. These must be identified in the dependency inventory and updated before the certificate is replaced.</w:t>
+      </w:r>
+    </w:p>
+    <w:p>
+      <w:pPr>
+        <w:pStyle w:val="BodyText"/>
+      </w:pPr>
+      <w:r>
+        <w:t xml:space="preserve">The PKI surface is addressed in Part 1 of this series (Landing Zone IPAM/DDI/PKI). The certificate authority decisions made in Part 1 apply directly to the SQL Server certificate migration described here.</w:t>
+      </w:r>
+    </w:p>
+    <w:bookmarkEnd w:id="76"/>
+    <w:bookmarkStart w:id="79" w:name="database-platform-decisions"/>
+    <w:p>
+      <w:pPr>
+        <w:pStyle w:val="Heading1"/>
+      </w:pPr>
+      <w:r>
+        <w:t xml:space="preserve">10. Database Platform Decisions</w:t>
+      </w:r>
+    </w:p>
+    <w:p>
+      <w:pPr>
+        <w:pStyle w:val="FirstParagraph"/>
+      </w:pPr>
+      <w:r>
+        <w:t xml:space="preserve">The SQL Server modernization program creates a rationalization gate at which the platform decision for each workload is revisited. SQL Server 2022 with Arc Managed Identity is the primary target, but two alternative platforms are worth evaluating:</w:t>
+      </w:r>
+    </w:p>
+    <w:bookmarkStart w:id="77" w:name="postgresql-for-new-workloads"/>
+    <w:p>
+      <w:pPr>
+        <w:pStyle w:val="Heading2"/>
+      </w:pPr>
+      <w:r>
+        <w:t xml:space="preserve">10.1 PostgreSQL for New Workloads</w:t>
+      </w:r>
+    </w:p>
+    <w:p>
+      <w:pPr>
+        <w:pStyle w:val="FirstParagraph"/>
+      </w:pPr>
+      <w:r>
+        <w:t xml:space="preserve">PostgreSQL on Azure Database for PostgreSQL — Flexible Server supports Entra authentication natively. For new database workloads with no existing PL/SQL or T-SQL corpus, PostgreSQL avoids the SQL Server licensing cost and provides equivalent Entra authentication posture.</w:t>
+      </w:r>
+    </w:p>
+    <w:p>
+      <w:pPr>
+        <w:pStyle w:val="BodyText"/>
+      </w:pPr>
+      <w:r>
+        <w:t xml:space="preserve">For existing workloads, schema migration from SQL Server to PostgreSQL requires the SQL Server Migration Assistant (SSMA) for PostgreSQL and significant testing effort. This is appropriate when the licensing cost savings justify the migration investment — typically when the SQL Server instance is a new deployment or a simple schema with minimal stored procedures.</w:t>
+      </w:r>
+    </w:p>
+    <w:bookmarkEnd w:id="77"/>
+    <w:bookmarkStart w:id="78" w:name="azure-sql-managed-instance"/>
+    <w:p>
+      <w:pPr>
+        <w:pStyle w:val="Heading2"/>
+      </w:pPr>
+      <w:r>
+        <w:t xml:space="preserve">10.2 Azure SQL Managed Instance</w:t>
+      </w:r>
+    </w:p>
+    <w:p>
+      <w:pPr>
+        <w:pStyle w:val="FirstParagraph"/>
+      </w:pPr>
+      <w:r>
+        <w:t xml:space="preserve">Azure SQL Managed Instance is a fully managed SQL Server deployment in Azure that supports Entra authentication and provides a path to a cloud-native posture without infrastructure management. It is appropriate when the workload can move off on-premises infrastructure entirely and the agency’s cloud strategy supports Azure-native hosting.</w:t>
+      </w:r>
+    </w:p>
+    <w:p>
+      <w:pPr>
+        <w:pStyle w:val="BodyText"/>
+      </w:pPr>
+      <w:r>
+        <w:t xml:space="preserve">The authentication migration described in this document applies to Azure SQL Managed Instance identically — Entra logins, Managed Identity connections, and Conditional Access policies work the same way.</w:t>
+      </w:r>
+    </w:p>
+    <w:bookmarkEnd w:id="78"/>
+    <w:bookmarkEnd w:id="79"/>
+    <w:bookmarkStart w:id="87" w:name="federal-compliance-alignment"/>
+    <w:p>
+      <w:pPr>
+        <w:pStyle w:val="Heading1"/>
+      </w:pPr>
+      <w:r>
+        <w:t xml:space="preserve">11. Federal Compliance Alignment</w:t>
+      </w:r>
+    </w:p>
+    <w:tbl>
+      <w:tblPr>
+        <w:tblStyle w:val="Table"/>
+        <w:tblW w:type="pct" w:w="5000"/>
+        <w:tblLayout w:type="fixed"/>
+        <w:tblLook w:firstRow="0" w:lastRow="0" w:firstColumn="0" w:lastColumn="0" w:noHBand="0" w:noVBand="0" w:val="0000"/>
+      </w:tblPr>
+      <w:tblGrid>
+        <w:gridCol w:w="7920"/>
+      </w:tblGrid>
+      <w:tr>
+        <w:tc>
+          <w:tcPr/>
+          <w:bookmarkStart w:id="83" w:name="fig-san06"/>
+          <w:p>
+            <w:pPr>
+              <w:pStyle w:val="Compact"/>
+              <w:jc w:val="center"/>
+            </w:pPr>
+            <w:r>
+              <w:drawing>
+                <wp:inline>
+                  <wp:extent cx="5334000" cy="2000250"/>
+                  <wp:effectExtent b="0" l="0" r="0" t="0"/>
+                  <wp:docPr descr="" title="" id="81" name="Picture"/>
+                  <a:graphic>
+                    <a:graphicData uri="http://schemas.openxmlformats.org/drawingml/2006/picture">
+                      <pic:pic>
+                        <pic:nvPicPr>
+                          <pic:cNvPr descr="figs/san-fig-06-fedramp-alignment.png" id="82" name="Picture"/>
+                          <pic:cNvPicPr>
+                            <a:picLocks noChangeArrowheads="1" noChangeAspect="1"/>
+                          </pic:cNvPicPr>
+                        </pic:nvPicPr>
+                        <pic:blipFill>
+                          <a:blip r:embed="rId80"/>
                           <a:stretch>
                             <a:fillRect/>
                           </a:stretch>
@@ -3608,14 +3866,14 @@
               <w:pStyle w:val="ImageCaption"/>
             </w:pPr>
             <w:r>
-              <w:t xml:space="preserve">Figure 6: Each SQL Server modernization milestone directly closes a federal compliance requirement. The cumulative effect is a posture aligned with FedRAMP 20x, Zero Trust, and NTLM elimination mandates.</w:t>
-            </w:r>
-          </w:p>
-          <w:bookmarkEnd w:id="71"/>
+              <w:t xml:space="preserve">Figure 9: Each SQL Server modernization milestone directly closes a federal compliance requirement. The cumulative effect is a posture aligned with FedRAMP 20x, Zero Trust, and NTLM elimination mandates.</w:t>
+            </w:r>
+          </w:p>
+          <w:bookmarkEnd w:id="83"/>
         </w:tc>
       </w:tr>
     </w:tbl>
-    <w:bookmarkStart w:id="73" w:name="nist-sp-800-53-rev-5-control-closure"/>
+    <w:bookmarkStart w:id="85" w:name="nist-sp-800-53-rev-5-control-closure"/>
     <w:p>
       <w:pPr>
         <w:pStyle w:val="Heading2"/>
@@ -3644,7 +3902,7 @@
       <w:r>
         <w:t xml:space="preserve"> </w:t>
       </w:r>
-      <w:hyperlink r:id="rId72">
+      <w:hyperlink r:id="rId84">
         <w:r>
           <w:rPr>
             <w:rStyle w:val="Hyperlink"/>
@@ -4363,8 +4621,8 @@
         </w:tc>
       </w:tr>
     </w:tbl>
-    <w:bookmarkEnd w:id="73"/>
-    <w:bookmarkStart w:id="74" w:name="fedramp-20x-key-security-indicators"/>
+    <w:bookmarkEnd w:id="85"/>
+    <w:bookmarkStart w:id="86" w:name="fedramp-20x-key-security-indicators"/>
     <w:p>
       <w:pPr>
         <w:pStyle w:val="Heading2"/>
@@ -4499,9 +4757,9 @@
         <w:t xml:space="preserve">These artifacts satisfy the IA-2, IA-5, AU-2, AU-12, CA-7, and CM-8 KSI requirements under FedRAMP 20x.</w:t>
       </w:r>
     </w:p>
-    <w:bookmarkEnd w:id="74"/>
-    <w:bookmarkEnd w:id="75"/>
-    <w:bookmarkStart w:id="76" w:name="summary"/>
+    <w:bookmarkEnd w:id="86"/>
+    <w:bookmarkEnd w:id="87"/>
+    <w:bookmarkStart w:id="88" w:name="summary"/>
     <w:p>
       <w:pPr>
         <w:pStyle w:val="Heading1"/>
@@ -4534,7 +4792,7 @@
         <w:t xml:space="preserve">The certificate authority and PKI decisions from Part 1 of this series provide the transport encryption foundation. The network segmentation and SD-WAN traffic class controls from Parts 5 and 6 provide the network-layer isolation. This part provides the identity and credential foundation. Together they constitute the application-aware networking posture required for FedRAMP 20x authorization.</w:t>
       </w:r>
     </w:p>
-    <w:bookmarkEnd w:id="76"/>
+    <w:bookmarkEnd w:id="88"/>
     <w:sectPr>
       <w:footnotePr>
         <w:numRestart w:val="eachSect"/>

</xml_diff>